<commit_message>
Auto-regenerate Coordinator Guide DOCX
</commit_message>
<xml_diff>
--- a/Rostas_Coordinator_Guide.docx
+++ b/Rostas_Coordinator_Guide.docx
@@ -10,7 +10,7 @@
       <w:r>
         <w:drawing>
           <wp:inline distT="0" distB="0" distL="0" distR="0">
-            <wp:extent cx="21774150000" cy="8709660000"/>
+            <wp:extent cx="2286000" cy="914400"/>
             <wp:effectExtent t="0" r="0" b="0" l="0"/>
             <wp:docPr id="1" name="" descr="" title=""/>
             <wp:cNvGraphicFramePr>
@@ -35,7 +35,7 @@
                   <pic:spPr bwMode="auto">
                     <a:xfrm>
                       <a:off x="0" y="0"/>
-                      <a:ext cx="21774150000" cy="8709660000"/>
+                      <a:ext cx="2286000" cy="914400"/>
                     </a:xfrm>
                     <a:prstGeom prst="rect">
                       <a:avLst/>
@@ -2677,7 +2677,7 @@
       <w:r>
         <w:drawing>
           <wp:inline distT="0" distB="0" distL="0" distR="0">
-            <wp:extent cx="22149149250" cy="19935444000"/>
+            <wp:extent cx="2324100" cy="2095500"/>
             <wp:effectExtent t="0" r="0" b="0" l="0"/>
             <wp:docPr id="1" name="" descr="" title=""/>
             <wp:cNvGraphicFramePr>
@@ -2702,7 +2702,7 @@
                   <pic:spPr bwMode="auto">
                     <a:xfrm>
                       <a:off x="0" y="0"/>
-                      <a:ext cx="22149149250" cy="19935444000"/>
+                      <a:ext cx="2324100" cy="2095500"/>
                     </a:xfrm>
                     <a:prstGeom prst="rect">
                       <a:avLst/>
@@ -2837,7 +2837,7 @@
       <w:r>
         <w:drawing>
           <wp:inline distT="0" distB="0" distL="0" distR="0">
-            <wp:extent cx="58294238250" cy="33810416250"/>
+            <wp:extent cx="6124575" cy="3552825"/>
             <wp:effectExtent t="0" r="0" b="0" l="0"/>
             <wp:docPr id="1" name="" descr="" title=""/>
             <wp:cNvGraphicFramePr>
@@ -2862,7 +2862,7 @@
                   <pic:spPr bwMode="auto">
                     <a:xfrm>
                       <a:off x="0" y="0"/>
-                      <a:ext cx="58294238250" cy="33810416250"/>
+                      <a:ext cx="6124575" cy="3552825"/>
                     </a:xfrm>
                     <a:prstGeom prst="rect">
                       <a:avLst/>
@@ -3335,7 +3335,7 @@
       <w:r>
         <w:drawing>
           <wp:inline distT="0" distB="0" distL="0" distR="0">
-            <wp:extent cx="58294238250" cy="33810416250"/>
+            <wp:extent cx="6124575" cy="3552825"/>
             <wp:effectExtent t="0" r="0" b="0" l="0"/>
             <wp:docPr id="1" name="" descr="" title=""/>
             <wp:cNvGraphicFramePr>
@@ -3360,7 +3360,7 @@
                   <pic:spPr bwMode="auto">
                     <a:xfrm>
                       <a:off x="0" y="0"/>
-                      <a:ext cx="58294238250" cy="33810416250"/>
+                      <a:ext cx="6124575" cy="3552825"/>
                     </a:xfrm>
                     <a:prstGeom prst="rect">
                       <a:avLst/>
@@ -3706,7 +3706,7 @@
       <w:r>
         <w:drawing>
           <wp:inline distT="0" distB="0" distL="0" distR="0">
-            <wp:extent cx="58294238250" cy="33810416250"/>
+            <wp:extent cx="6124575" cy="3552825"/>
             <wp:effectExtent t="0" r="0" b="0" l="0"/>
             <wp:docPr id="1" name="" descr="" title=""/>
             <wp:cNvGraphicFramePr>
@@ -3731,7 +3731,7 @@
                   <pic:spPr bwMode="auto">
                     <a:xfrm>
                       <a:off x="0" y="0"/>
-                      <a:ext cx="58294238250" cy="33810416250"/>
+                      <a:ext cx="6124575" cy="3552825"/>
                     </a:xfrm>
                     <a:prstGeom prst="rect">
                       <a:avLst/>
@@ -3772,7 +3772,7 @@
       <w:r>
         <w:drawing>
           <wp:inline distT="0" distB="0" distL="0" distR="0">
-            <wp:extent cx="58294238250" cy="33810416250"/>
+            <wp:extent cx="6124575" cy="3552825"/>
             <wp:effectExtent t="0" r="0" b="0" l="0"/>
             <wp:docPr id="1" name="" descr="" title=""/>
             <wp:cNvGraphicFramePr>
@@ -3797,7 +3797,7 @@
                   <pic:spPr bwMode="auto">
                     <a:xfrm>
                       <a:off x="0" y="0"/>
-                      <a:ext cx="58294238250" cy="33810416250"/>
+                      <a:ext cx="6124575" cy="3552825"/>
                     </a:xfrm>
                     <a:prstGeom prst="rect">
                       <a:avLst/>
@@ -4087,7 +4087,7 @@
       <w:r>
         <w:drawing>
           <wp:inline distT="0" distB="0" distL="0" distR="0">
-            <wp:extent cx="58294238250" cy="33810416250"/>
+            <wp:extent cx="6124575" cy="3552825"/>
             <wp:effectExtent t="0" r="0" b="0" l="0"/>
             <wp:docPr id="1" name="" descr="" title=""/>
             <wp:cNvGraphicFramePr>
@@ -4112,7 +4112,7 @@
                   <pic:spPr bwMode="auto">
                     <a:xfrm>
                       <a:off x="0" y="0"/>
-                      <a:ext cx="58294238250" cy="33810416250"/>
+                      <a:ext cx="6124575" cy="3552825"/>
                     </a:xfrm>
                     <a:prstGeom prst="rect">
                       <a:avLst/>
@@ -4153,7 +4153,7 @@
       <w:r>
         <w:drawing>
           <wp:inline distT="0" distB="0" distL="0" distR="0">
-            <wp:extent cx="32643079875" cy="22850760750"/>
+            <wp:extent cx="3429000" cy="2400300"/>
             <wp:effectExtent t="0" r="0" b="0" l="0"/>
             <wp:docPr id="1" name="" descr="" title=""/>
             <wp:cNvGraphicFramePr>
@@ -4178,7 +4178,7 @@
                   <pic:spPr bwMode="auto">
                     <a:xfrm>
                       <a:off x="0" y="0"/>
-                      <a:ext cx="32643079875" cy="22850760750"/>
+                      <a:ext cx="3429000" cy="2400300"/>
                     </a:xfrm>
                     <a:prstGeom prst="rect">
                       <a:avLst/>
@@ -4442,7 +4442,7 @@
       <w:r>
         <w:drawing>
           <wp:inline distT="0" distB="0" distL="0" distR="0">
-            <wp:extent cx="58294238250" cy="33810416250"/>
+            <wp:extent cx="6124575" cy="3552825"/>
             <wp:effectExtent t="0" r="0" b="0" l="0"/>
             <wp:docPr id="1" name="" descr="" title=""/>
             <wp:cNvGraphicFramePr>
@@ -4467,7 +4467,7 @@
                   <pic:spPr bwMode="auto">
                     <a:xfrm>
                       <a:off x="0" y="0"/>
-                      <a:ext cx="58294238250" cy="33810416250"/>
+                      <a:ext cx="6124575" cy="3552825"/>
                     </a:xfrm>
                     <a:prstGeom prst="rect">
                       <a:avLst/>
@@ -4508,7 +4508,7 @@
       <w:r>
         <w:drawing>
           <wp:inline distT="0" distB="0" distL="0" distR="0">
-            <wp:extent cx="32643079875" cy="22850760750"/>
+            <wp:extent cx="3429000" cy="2400300"/>
             <wp:effectExtent t="0" r="0" b="0" l="0"/>
             <wp:docPr id="1" name="" descr="" title=""/>
             <wp:cNvGraphicFramePr>
@@ -4533,7 +4533,7 @@
                   <pic:spPr bwMode="auto">
                     <a:xfrm>
                       <a:off x="0" y="0"/>
-                      <a:ext cx="32643079875" cy="22850760750"/>
+                      <a:ext cx="3429000" cy="2400300"/>
                     </a:xfrm>
                     <a:prstGeom prst="rect">
                       <a:avLst/>
@@ -4712,7 +4712,7 @@
       <w:r>
         <w:drawing>
           <wp:inline distT="0" distB="0" distL="0" distR="0">
-            <wp:extent cx="58294238250" cy="33810416250"/>
+            <wp:extent cx="6124575" cy="3552825"/>
             <wp:effectExtent t="0" r="0" b="0" l="0"/>
             <wp:docPr id="1" name="" descr="" title=""/>
             <wp:cNvGraphicFramePr>
@@ -4737,7 +4737,7 @@
                   <pic:spPr bwMode="auto">
                     <a:xfrm>
                       <a:off x="0" y="0"/>
-                      <a:ext cx="58294238250" cy="33810416250"/>
+                      <a:ext cx="6124575" cy="3552825"/>
                     </a:xfrm>
                     <a:prstGeom prst="rect">
                       <a:avLst/>
@@ -5154,7 +5154,7 @@
       <w:r>
         <w:drawing>
           <wp:inline distT="0" distB="0" distL="0" distR="0">
-            <wp:extent cx="58294238250" cy="33810416250"/>
+            <wp:extent cx="6124575" cy="3552825"/>
             <wp:effectExtent t="0" r="0" b="0" l="0"/>
             <wp:docPr id="1" name="" descr="" title=""/>
             <wp:cNvGraphicFramePr>
@@ -5179,7 +5179,7 @@
                   <pic:spPr bwMode="auto">
                     <a:xfrm>
                       <a:off x="0" y="0"/>
-                      <a:ext cx="58294238250" cy="33810416250"/>
+                      <a:ext cx="6124575" cy="3552825"/>
                     </a:xfrm>
                     <a:prstGeom prst="rect">
                       <a:avLst/>
@@ -5220,7 +5220,7 @@
       <w:r>
         <w:drawing>
           <wp:inline distT="0" distB="0" distL="0" distR="0">
-            <wp:extent cx="32643079875" cy="22850760750"/>
+            <wp:extent cx="3429000" cy="2400300"/>
             <wp:effectExtent t="0" r="0" b="0" l="0"/>
             <wp:docPr id="1" name="" descr="" title=""/>
             <wp:cNvGraphicFramePr>
@@ -5245,7 +5245,7 @@
                   <pic:spPr bwMode="auto">
                     <a:xfrm>
                       <a:off x="0" y="0"/>
-                      <a:ext cx="32643079875" cy="22850760750"/>
+                      <a:ext cx="3429000" cy="2400300"/>
                     </a:xfrm>
                     <a:prstGeom prst="rect">
                       <a:avLst/>
@@ -5425,7 +5425,7 @@
       <w:r>
         <w:drawing>
           <wp:inline distT="0" distB="0" distL="0" distR="0">
-            <wp:extent cx="58294238250" cy="33810416250"/>
+            <wp:extent cx="6124575" cy="3552825"/>
             <wp:effectExtent t="0" r="0" b="0" l="0"/>
             <wp:docPr id="1" name="" descr="" title=""/>
             <wp:cNvGraphicFramePr>
@@ -5450,7 +5450,7 @@
                   <pic:spPr bwMode="auto">
                     <a:xfrm>
                       <a:off x="0" y="0"/>
-                      <a:ext cx="58294238250" cy="33810416250"/>
+                      <a:ext cx="6124575" cy="3552825"/>
                     </a:xfrm>
                     <a:prstGeom prst="rect">
                       <a:avLst/>
@@ -6385,7 +6385,7 @@
       <w:r>
         <w:drawing>
           <wp:inline distT="0" distB="0" distL="0" distR="0">
-            <wp:extent cx="58294238250" cy="33810416250"/>
+            <wp:extent cx="6124575" cy="3552825"/>
             <wp:effectExtent t="0" r="0" b="0" l="0"/>
             <wp:docPr id="1" name="" descr="" title=""/>
             <wp:cNvGraphicFramePr>
@@ -6410,7 +6410,7 @@
                   <pic:spPr bwMode="auto">
                     <a:xfrm>
                       <a:off x="0" y="0"/>
-                      <a:ext cx="58294238250" cy="33810416250"/>
+                      <a:ext cx="6124575" cy="3552825"/>
                     </a:xfrm>
                     <a:prstGeom prst="rect">
                       <a:avLst/>
@@ -6963,7 +6963,7 @@
       <w:r>
         <w:drawing>
           <wp:inline distT="0" distB="0" distL="0" distR="0">
-            <wp:extent cx="58294238250" cy="33810416250"/>
+            <wp:extent cx="6124575" cy="3552825"/>
             <wp:effectExtent t="0" r="0" b="0" l="0"/>
             <wp:docPr id="1" name="" descr="" title=""/>
             <wp:cNvGraphicFramePr>
@@ -6988,7 +6988,7 @@
                   <pic:spPr bwMode="auto">
                     <a:xfrm>
                       <a:off x="0" y="0"/>
-                      <a:ext cx="58294238250" cy="33810416250"/>
+                      <a:ext cx="6124575" cy="3552825"/>
                     </a:xfrm>
                     <a:prstGeom prst="rect">
                       <a:avLst/>
@@ -7550,7 +7550,7 @@
       <w:r>
         <w:drawing>
           <wp:inline distT="0" distB="0" distL="0" distR="0">
-            <wp:extent cx="32643079875" cy="22850760750"/>
+            <wp:extent cx="3429000" cy="2400300"/>
             <wp:effectExtent t="0" r="0" b="0" l="0"/>
             <wp:docPr id="1" name="" descr="" title=""/>
             <wp:cNvGraphicFramePr>
@@ -7575,7 +7575,7 @@
                   <pic:spPr bwMode="auto">
                     <a:xfrm>
                       <a:off x="0" y="0"/>
-                      <a:ext cx="32643079875" cy="22850760750"/>
+                      <a:ext cx="3429000" cy="2400300"/>
                     </a:xfrm>
                     <a:prstGeom prst="rect">
                       <a:avLst/>

</xml_diff>